<commit_message>
Add webhook server, ARCHITECTURE.md, update README
</commit_message>
<xml_diff>
--- a/ARCHITECTURE.docx
+++ b/ARCHITECTURE.docx
@@ -59,6 +59,25 @@
               <w:t xml:space="preserve">Sajed Hamdan  |  AI Engineer Assessment  |  Valsoft / Aspire Software  |  March 2026</w:t>
             </w:r>
           </w:p>
+          <w:p>
+            <w:pPr>
+              <w:spacing w:before="60" w:after="60"/>
+            </w:pPr>
+            <w:r>
+              <w:t xml:space="preserve"/>
+            </w:r>
+          </w:p>
+          <w:p>
+            <w:r>
+              <w:rPr>
+                <w:rFonts w:ascii="Arial" w:cs="Arial" w:eastAsia="Arial" w:hAnsi="Arial"/>
+                <w:color w:val="BDD7EE"/>
+                <w:sz w:val="19"/>
+                <w:szCs w:val="19"/>
+              </w:rPr>
+              <w:t xml:space="preserve">Stack: Python 3.12  ·  FastAPI  ·  Groq (Llama 3.3 70B)  ·  Google Sheets</w:t>
+            </w:r>
+          </w:p>
         </w:tc>
       </w:tr>
     </w:tbl>
@@ -100,7 +119,7 @@
           <w:sz w:val="21"/>
           <w:szCs w:val="21"/>
         </w:rPr>
-        <w:t xml:space="preserve">The pipeline is a six-step Python application orchestrated by main.py. Each step lives in its own module, so any component can be tuned or replaced without touching the others. State is held in memory as a single dictionary per message that accumulates fields as it moves through the pipeline — nothing is written to disk or a database mid-run.</w:t>
+        <w:t xml:space="preserve">The pipeline is a six-step Python application with a FastAPI webhook server as its ingestion layer. Each pipeline step lives in its own module, so any component can be tuned or replaced without touching the others. State is held in memory as a single dictionary per message that accumulates fields as it moves through the pipeline.</w:t>
       </w:r>
     </w:p>
     <w:p>
@@ -122,7 +141,47 @@
           <w:sz w:val="21"/>
           <w:szCs w:val="21"/>
         </w:rPr>
-        <w:t xml:space="preserve">The flow is linear and sequential: main.py loads sample_inputs.json (Step 1 — Ingestion), calls classifier.py which sends the raw message to the Groq LLM and returns category, priority, and confidence score (Step 2), then calls enricher.py which makes a second LLM call to extract the core issue, identifiers, and urgency signal (Step 3). The result is passed to router.py for a deterministic queue assignment (Step 4), then to escalation.py which checks three rules and overrides the queue if needed (Step 6). Finally summarizer.py generates a human-readable handoff summary and output_writer.py persists the complete record to both a local JSON file and a Google Sheet (Step 5).</w:t>
+        <w:t xml:space="preserve">The entry point is </w:t>
+      </w:r>
+      <w:r>
+        <w:rPr>
+          <w:rFonts w:ascii="Arial" w:cs="Arial" w:eastAsia="Arial" w:hAnsi="Arial"/>
+          <w:b/>
+          <w:bCs/>
+          <w:color w:val="222222"/>
+          <w:sz w:val="21"/>
+          <w:szCs w:val="21"/>
+        </w:rPr>
+        <w:t xml:space="preserve">webhook_server.py</w:t>
+      </w:r>
+      <w:r>
+        <w:rPr>
+          <w:rFonts w:ascii="Arial" w:cs="Arial" w:eastAsia="Arial" w:hAnsi="Arial"/>
+          <w:color w:val="222222"/>
+          <w:sz w:val="21"/>
+          <w:szCs w:val="21"/>
+        </w:rPr>
+        <w:t xml:space="preserve"> — a FastAPI server that listens on port 8000 for inbound POST requests at the </w:t>
+      </w:r>
+      <w:r>
+        <w:rPr>
+          <w:rFonts w:ascii="Arial" w:cs="Arial" w:eastAsia="Arial" w:hAnsi="Arial"/>
+          <w:b/>
+          <w:bCs/>
+          <w:color w:val="222222"/>
+          <w:sz w:val="21"/>
+          <w:szCs w:val="21"/>
+        </w:rPr>
+        <w:t xml:space="preserve">/triage</w:t>
+      </w:r>
+      <w:r>
+        <w:rPr>
+          <w:rFonts w:ascii="Arial" w:cs="Arial" w:eastAsia="Arial" w:hAnsi="Arial"/>
+          <w:color w:val="222222"/>
+          <w:sz w:val="21"/>
+          <w:szCs w:val="21"/>
+        </w:rPr>
+        <w:t xml:space="preserve"> endpoint. Each request carries a raw customer message with its source channel (Email, Web Form, or Support Portal). The moment a request arrives, the server automatically triggers the full pipeline for that message — no manual intervention required.</w:t>
       </w:r>
     </w:p>
     <w:p>
@@ -144,7 +203,169 @@
           <w:sz w:val="21"/>
           <w:szCs w:val="21"/>
         </w:rPr>
-        <w:t xml:space="preserve">Two of the three LLM calls — classification and enrichment — are independent and could be parallelised in a future iteration. The summary call depends on both, so it runs last by design.</w:t>
+        <w:t xml:space="preserve">The flow is as follows: the webhook receives the raw message (Step 1 — Ingestion) and calls </w:t>
+      </w:r>
+      <w:r>
+        <w:rPr>
+          <w:rFonts w:ascii="Arial" w:cs="Arial" w:eastAsia="Arial" w:hAnsi="Arial"/>
+          <w:b/>
+          <w:bCs/>
+          <w:color w:val="222222"/>
+          <w:sz w:val="21"/>
+          <w:szCs w:val="21"/>
+        </w:rPr>
+        <w:t xml:space="preserve">classifier.py</w:t>
+      </w:r>
+      <w:r>
+        <w:rPr>
+          <w:rFonts w:ascii="Arial" w:cs="Arial" w:eastAsia="Arial" w:hAnsi="Arial"/>
+          <w:color w:val="222222"/>
+          <w:sz w:val="21"/>
+          <w:szCs w:val="21"/>
+        </w:rPr>
+        <w:t xml:space="preserve"> which sends it to the Groq LLM returning category, priority, and confidence score (Step 2). It then calls </w:t>
+      </w:r>
+      <w:r>
+        <w:rPr>
+          <w:rFonts w:ascii="Arial" w:cs="Arial" w:eastAsia="Arial" w:hAnsi="Arial"/>
+          <w:b/>
+          <w:bCs/>
+          <w:color w:val="222222"/>
+          <w:sz w:val="21"/>
+          <w:szCs w:val="21"/>
+        </w:rPr>
+        <w:t xml:space="preserve">enricher.py</w:t>
+      </w:r>
+      <w:r>
+        <w:rPr>
+          <w:rFonts w:ascii="Arial" w:cs="Arial" w:eastAsia="Arial" w:hAnsi="Arial"/>
+          <w:color w:val="222222"/>
+          <w:sz w:val="21"/>
+          <w:szCs w:val="21"/>
+        </w:rPr>
+        <w:t xml:space="preserve"> for a second LLM call extracting the core issue, identifiers, and urgency signal (Step 3). The result passes to </w:t>
+      </w:r>
+      <w:r>
+        <w:rPr>
+          <w:rFonts w:ascii="Arial" w:cs="Arial" w:eastAsia="Arial" w:hAnsi="Arial"/>
+          <w:b/>
+          <w:bCs/>
+          <w:color w:val="222222"/>
+          <w:sz w:val="21"/>
+          <w:szCs w:val="21"/>
+        </w:rPr>
+        <w:t xml:space="preserve">router.py</w:t>
+      </w:r>
+      <w:r>
+        <w:rPr>
+          <w:rFonts w:ascii="Arial" w:cs="Arial" w:eastAsia="Arial" w:hAnsi="Arial"/>
+          <w:color w:val="222222"/>
+          <w:sz w:val="21"/>
+          <w:szCs w:val="21"/>
+        </w:rPr>
+        <w:t xml:space="preserve"> for deterministic queue assignment (Step 4), then to </w:t>
+      </w:r>
+      <w:r>
+        <w:rPr>
+          <w:rFonts w:ascii="Arial" w:cs="Arial" w:eastAsia="Arial" w:hAnsi="Arial"/>
+          <w:b/>
+          <w:bCs/>
+          <w:color w:val="222222"/>
+          <w:sz w:val="21"/>
+          <w:szCs w:val="21"/>
+        </w:rPr>
+        <w:t xml:space="preserve">escalation.py</w:t>
+      </w:r>
+      <w:r>
+        <w:rPr>
+          <w:rFonts w:ascii="Arial" w:cs="Arial" w:eastAsia="Arial" w:hAnsi="Arial"/>
+          <w:color w:val="222222"/>
+          <w:sz w:val="21"/>
+          <w:szCs w:val="21"/>
+        </w:rPr>
+        <w:t xml:space="preserve"> which checks three rules and overrides the queue if needed (Step 6). Finally </w:t>
+      </w:r>
+      <w:r>
+        <w:rPr>
+          <w:rFonts w:ascii="Arial" w:cs="Arial" w:eastAsia="Arial" w:hAnsi="Arial"/>
+          <w:b/>
+          <w:bCs/>
+          <w:color w:val="222222"/>
+          <w:sz w:val="21"/>
+          <w:szCs w:val="21"/>
+        </w:rPr>
+        <w:t xml:space="preserve">summarizer.py</w:t>
+      </w:r>
+      <w:r>
+        <w:rPr>
+          <w:rFonts w:ascii="Arial" w:cs="Arial" w:eastAsia="Arial" w:hAnsi="Arial"/>
+          <w:color w:val="222222"/>
+          <w:sz w:val="21"/>
+          <w:szCs w:val="21"/>
+        </w:rPr>
+        <w:t xml:space="preserve"> generates a human-readable handoff summary and </w:t>
+      </w:r>
+      <w:r>
+        <w:rPr>
+          <w:rFonts w:ascii="Arial" w:cs="Arial" w:eastAsia="Arial" w:hAnsi="Arial"/>
+          <w:b/>
+          <w:bCs/>
+          <w:color w:val="222222"/>
+          <w:sz w:val="21"/>
+          <w:szCs w:val="21"/>
+        </w:rPr>
+        <w:t xml:space="preserve">output_writer.py</w:t>
+      </w:r>
+      <w:r>
+        <w:rPr>
+          <w:rFonts w:ascii="Arial" w:cs="Arial" w:eastAsia="Arial" w:hAnsi="Arial"/>
+          <w:color w:val="222222"/>
+          <w:sz w:val="21"/>
+          <w:szCs w:val="21"/>
+        </w:rPr>
+        <w:t xml:space="preserve"> persists the complete record to both a local JSON file and a Google Sheet simultaneously (Step 5).</w:t>
+      </w:r>
+    </w:p>
+    <w:p>
+      <w:pPr>
+        <w:spacing w:before="40" w:after="40"/>
+      </w:pPr>
+      <w:r>
+        <w:t xml:space="preserve"/>
+      </w:r>
+    </w:p>
+    <w:p>
+      <w:pPr>
+        <w:spacing w:before="60" w:after="60"/>
+      </w:pPr>
+      <w:r>
+        <w:rPr>
+          <w:rFonts w:ascii="Arial" w:cs="Arial" w:eastAsia="Arial" w:hAnsi="Arial"/>
+          <w:color w:val="222222"/>
+          <w:sz w:val="21"/>
+          <w:szCs w:val="21"/>
+        </w:rPr>
+        <w:t xml:space="preserve">For demonstration purposes, </w:t>
+      </w:r>
+      <w:r>
+        <w:rPr>
+          <w:rFonts w:ascii="Arial" w:cs="Arial" w:eastAsia="Arial" w:hAnsi="Arial"/>
+          <w:b/>
+          <w:bCs/>
+          <w:color w:val="222222"/>
+          <w:sz w:val="21"/>
+          <w:szCs w:val="21"/>
+        </w:rPr>
+        <w:t xml:space="preserve">send_messages.py</w:t>
+      </w:r>
+      <w:r>
+        <w:rPr>
+          <w:rFonts w:ascii="Arial" w:cs="Arial" w:eastAsia="Arial" w:hAnsi="Arial"/>
+          <w:color w:val="222222"/>
+          <w:sz w:val="21"/>
+          <w:szCs w:val="21"/>
+        </w:rPr>
+        <w:t xml:space="preserve"> simulates the inbound traffic — it sends all five synthetic messages as sequential POST requests to the webhook, exactly as a real email provider or web form integration would. In production this script is replaced by live integrations with Gmail, web form providers, or support portal APIs.</w:t>
       </w:r>
     </w:p>
     <w:p>
@@ -185,7 +406,27 @@
           <w:sz w:val="21"/>
           <w:szCs w:val="21"/>
         </w:rPr>
-        <w:t xml:space="preserve">Routing is a pure lookup table in router.py — no LLM involved. The five categories map as follows: Bug Report and Incident/Outage both route to Engineering; Feature Request routes to Product; Billing Issue routes to Billing; Technical Question routes to IT/Security. Any Unclassified result routes directly to Escalation.</w:t>
+        <w:t xml:space="preserve">Routing is a pure lookup table in </w:t>
+      </w:r>
+      <w:r>
+        <w:rPr>
+          <w:rFonts w:ascii="Arial" w:cs="Arial" w:eastAsia="Arial" w:hAnsi="Arial"/>
+          <w:b/>
+          <w:bCs/>
+          <w:color w:val="222222"/>
+          <w:sz w:val="21"/>
+          <w:szCs w:val="21"/>
+        </w:rPr>
+        <w:t xml:space="preserve">router.py</w:t>
+      </w:r>
+      <w:r>
+        <w:rPr>
+          <w:rFonts w:ascii="Arial" w:cs="Arial" w:eastAsia="Arial" w:hAnsi="Arial"/>
+          <w:color w:val="222222"/>
+          <w:sz w:val="21"/>
+          <w:szCs w:val="21"/>
+        </w:rPr>
+        <w:t xml:space="preserve"> — no LLM involved. The five categories map as follows: Bug Report and Incident/Outage route to Engineering; Feature Request routes to Product; Billing Issue routes to Billing; Technical Question routes to IT/Security. Any Unclassified result routes directly to Escalation.</w:t>
       </w:r>
     </w:p>
     <w:p>
@@ -207,7 +448,7 @@
           <w:sz w:val="21"/>
           <w:szCs w:val="21"/>
         </w:rPr>
-        <w:t xml:space="preserve">I deliberately kept routing as deterministic logic rather than an LLM decision because routing needs to be auditable — a manager should always be able to point to the exact rule that sent a ticket somewhere. The routing table is also the easiest thing to extend: adding a new category means adding one line.</w:t>
+        <w:t xml:space="preserve">Routing is intentionally deterministic rather than LLM-driven because routing decisions must be auditable. A manager should always be able to point to the exact rule that sent a ticket to a particular queue. The routing table is also trivially extensible — adding a new category is a single line change.</w:t>
       </w:r>
     </w:p>
     <w:p>
@@ -229,27 +470,27 @@
           <w:sz w:val="21"/>
           <w:szCs w:val="21"/>
         </w:rPr>
-        <w:t xml:space="preserve">One additional rule sits on top of the table: if the model's </w:t>
-      </w:r>
-      <w:r>
-        <w:rPr>
-          <w:rFonts w:ascii="Arial" w:cs="Arial" w:eastAsia="Arial" w:hAnsi="Arial"/>
-          <w:b/>
-          <w:bCs/>
-          <w:color w:val="222222"/>
-          <w:sz w:val="21"/>
-          <w:szCs w:val="21"/>
-        </w:rPr>
-        <w:t xml:space="preserve">confidence score is below 70%</w:t>
-      </w:r>
-      <w:r>
-        <w:rPr>
-          <w:rFonts w:ascii="Arial" w:cs="Arial" w:eastAsia="Arial" w:hAnsi="Arial"/>
-          <w:color w:val="222222"/>
-          <w:sz w:val="21"/>
-          <w:szCs w:val="21"/>
-        </w:rPr>
-        <w:t xml:space="preserve">, the category assignment is ignored and the message routes to Escalation regardless. A confident wrong classification is better caught at the escalation layer; an uncertain classification should never reach a team queue automatically.</w:t>
+        <w:t xml:space="preserve">One rule sits on top of the table: if the model's confidence score falls </w:t>
+      </w:r>
+      <w:r>
+        <w:rPr>
+          <w:rFonts w:ascii="Arial" w:cs="Arial" w:eastAsia="Arial" w:hAnsi="Arial"/>
+          <w:b/>
+          <w:bCs/>
+          <w:color w:val="222222"/>
+          <w:sz w:val="21"/>
+          <w:szCs w:val="21"/>
+        </w:rPr>
+        <w:t xml:space="preserve">below 70%</w:t>
+      </w:r>
+      <w:r>
+        <w:rPr>
+          <w:rFonts w:ascii="Arial" w:cs="Arial" w:eastAsia="Arial" w:hAnsi="Arial"/>
+          <w:color w:val="222222"/>
+          <w:sz w:val="21"/>
+          <w:szCs w:val="21"/>
+        </w:rPr>
+        <w:t xml:space="preserve">, the category assignment is ignored and the message routes to Escalation regardless. An uncertain classification should never reach a team queue automatically — the cost of a wrong routing decision exceeds the cost of a human review.</w:t>
       </w:r>
     </w:p>
     <w:p>
@@ -328,7 +569,7 @@
           <w:sz w:val="21"/>
           <w:szCs w:val="21"/>
         </w:rPr>
-        <w:t xml:space="preserve">the model is uncertain; human judgment is required before routing.</w:t>
+        <w:t xml:space="preserve">the model is uncertain and human judgment is required before routing.</w:t>
       </w:r>
     </w:p>
     <w:p>
@@ -358,7 +599,7 @@
           <w:sz w:val="21"/>
           <w:szCs w:val="21"/>
         </w:rPr>
-        <w:t xml:space="preserve">outage, down for all users, multiple users affected, data loss, cannot access, security breach. Any of these in the raw message triggers immediate escalation regardless of confidence. I made keyword matching intentionally broad — a false positive (escalating something minor) is far cheaper than a false negative (missing a live outage).</w:t>
+        <w:t xml:space="preserve">outage, down for all users, multiple users affected, data loss, cannot access, security breach. Any of these in the raw message triggers immediate escalation. Keyword matching is intentionally broad — a false positive costs a human five minutes; a false negative on a live outage costs the business far more.</w:t>
       </w:r>
     </w:p>
     <w:p>
@@ -388,7 +629,7 @@
           <w:sz w:val="21"/>
           <w:szCs w:val="21"/>
         </w:rPr>
-        <w:t xml:space="preserve">extracted via regex from Billing Issue messages. Financial discrepancies of this size carry legal and contractual implications that warrant human review.</w:t>
+        <w:t xml:space="preserve">extracted via regex from Billing Issue messages. Financial discrepancies of this size carry legal and contractual implications requiring human review before any automated action.</w:t>
       </w:r>
     </w:p>
     <w:p>
@@ -410,7 +651,29 @@
           <w:sz w:val="21"/>
           <w:szCs w:val="21"/>
         </w:rPr>
-        <w:t xml:space="preserve">Messages #3 (invoice discrepancy of $1,240) and #5 (dashboard outage, multiple users) both correctly triggered escalation in the test run. Messages #1, #2, and #4 correctly did not.</w:t>
+        <w:t xml:space="preserve">In the test run: Message #3 (invoice discrepancy of $1,240) and Message #5 (dashboard outage, multiple users) both correctly triggered escalation. Messages #1, #2, and #4 correctly did not.</w:t>
+      </w:r>
+    </w:p>
+    <w:p>
+      <w:pPr>
+        <w:spacing w:before="40" w:after="40"/>
+      </w:pPr>
+      <w:r>
+        <w:t xml:space="preserve"/>
+      </w:r>
+    </w:p>
+    <w:p>
+      <w:pPr>
+        <w:spacing w:before="60" w:after="60"/>
+      </w:pPr>
+      <w:r>
+        <w:rPr>
+          <w:rFonts w:ascii="Arial" w:cs="Arial" w:eastAsia="Arial" w:hAnsi="Arial"/>
+          <w:color w:val="222222"/>
+          <w:sz w:val="21"/>
+          <w:szCs w:val="21"/>
+        </w:rPr>
+        <w:t xml:space="preserve">Escalation uses a rule engine rather than an LLM because escalation decisions must be transparent and auditable. Every escalation can be traced to the exact rule that fired — something LLM-based escalation cannot guarantee.</w:t>
       </w:r>
     </w:p>
     <w:p>
@@ -475,7 +738,7 @@
           <w:sz w:val="21"/>
           <w:szCs w:val="21"/>
         </w:rPr>
-        <w:t xml:space="preserve">add exponential backoff with three retries on LLM calls, a dead-letter queue for messages that exhaust retries, and structured logging with a per-message correlation ID. The current print-based logging would be unmanageable at scale.</w:t>
+        <w:t xml:space="preserve">add exponential backoff with three retries on LLM calls, a dead-letter queue for messages that exhaust retries, and structured logging with a per-message correlation ID. Replace print statements with a proper logging framework. The FastAPI server would be containerised with Docker and deployed behind a load balancer.</w:t>
       </w:r>
     </w:p>
     <w:p>
@@ -505,7 +768,7 @@
           <w:sz w:val="21"/>
           <w:szCs w:val="21"/>
         </w:rPr>
-        <w:t xml:space="preserve">at 10,000 tickets per day, three LLM calls per message adds up. I would merge classification and enrichment into a single call with a combined JSON schema (saving ~33% of API calls), and introduce a tiered model strategy — use Llama 3.1 8B for high-confidence obvious cases and reserve 70B for ambiguous or escalated records. This could reduce cost by 60–70% with minimal accuracy impact.</w:t>
+        <w:t xml:space="preserve">at 10,000 tickets per day, three LLM calls per message adds up significantly. I would merge classification and enrichment into a single call with a combined JSON schema (saving ~33% of API calls), and introduce a tiered model strategy — Llama 3.1 8B for high-confidence obvious cases, 70B reserved for ambiguous or escalated records. This could reduce cost by 60-70% with minimal accuracy impact.</w:t>
       </w:r>
     </w:p>
     <w:p>
@@ -535,7 +798,7 @@
           <w:sz w:val="21"/>
           <w:szCs w:val="21"/>
         </w:rPr>
-        <w:t xml:space="preserve">parallelise the classification and enrichment calls using asyncio. They are fully independent and together account for roughly two thirds of per-message latency. Running them concurrently would cut end-to-end time nearly in half.</w:t>
+        <w:t xml:space="preserve">classification and enrichment are fully independent and could run in parallel using FastAPI's async capabilities and asyncio.gather(). This would cut per-message latency nearly in half. The summary call depends on both and correctly runs last.</w:t>
       </w:r>
     </w:p>
     <w:p>
@@ -565,42 +828,7 @@
           <w:sz w:val="21"/>
           <w:szCs w:val="21"/>
         </w:rPr>
-        <w:t xml:space="preserve">move prompts out of Python files and into a versioned config store. This decouples prompt iteration from code deployments and enables A/B testing without a release cycle.</w:t>
-      </w:r>
-    </w:p>
-    <w:p>
-      <w:pPr>
-        <w:spacing w:before="80" w:after="80"/>
-      </w:pPr>
-      <w:r>
-        <w:t xml:space="preserve"/>
-      </w:r>
-    </w:p>
-    <w:p>
-      <w:pPr>
-        <w:pBdr>
-          <w:bottom w:val="single" w:color="2E75B6" w:sz="6" w:space="3"/>
-        </w:pBdr>
-        <w:spacing w:before="280" w:after="100"/>
-      </w:pPr>
-      <w:r>
-        <w:rPr>
-          <w:rFonts w:ascii="Arial" w:cs="Arial" w:eastAsia="Arial" w:hAnsi="Arial"/>
-          <w:b/>
-          <w:bCs/>
-          <w:color w:val="1E3A5F"/>
-          <w:sz w:val="26"/>
-          <w:szCs w:val="26"/>
-        </w:rPr>
-        <w:t xml:space="preserve">5. Phase 2 — With One More Week</w:t>
-      </w:r>
-    </w:p>
-    <w:p>
-      <w:pPr>
-        <w:spacing w:before="30" w:after="30"/>
-      </w:pPr>
-      <w:r>
-        <w:t xml:space="preserve"/>
+        <w:t xml:space="preserve">move prompts out of Python files into a versioned config store so they can be updated, rolled back, and A/B tested without a code deployment.</w:t>
       </w:r>
     </w:p>
     <w:p>
@@ -621,16 +849,51 @@
           <w:sz w:val="21"/>
           <w:szCs w:val="21"/>
         </w:rPr>
-        <w:t xml:space="preserve">Live webhook trigger: </w:t>
-      </w:r>
-      <w:r>
-        <w:rPr>
-          <w:rFonts w:ascii="Arial" w:cs="Arial" w:eastAsia="Arial" w:hAnsi="Arial"/>
-          <w:color w:val="222222"/>
-          <w:sz w:val="21"/>
-          <w:szCs w:val="21"/>
-        </w:rPr>
-        <w:t xml:space="preserve">replace the JSON file input with a FastAPI endpoint that receives POST requests from email providers and web forms, making the pipeline genuinely real-time.</w:t>
+        <w:t xml:space="preserve">Model drift monitoring: </w:t>
+      </w:r>
+      <w:r>
+        <w:rPr>
+          <w:rFonts w:ascii="Arial" w:cs="Arial" w:eastAsia="Arial" w:hAnsi="Arial"/>
+          <w:color w:val="222222"/>
+          <w:sz w:val="21"/>
+          <w:szCs w:val="21"/>
+        </w:rPr>
+        <w:t xml:space="preserve">log every classification result and run weekly accuracy checks against a labeled validation set to detect provider-side model drift before it impacts routing quality.</w:t>
+      </w:r>
+    </w:p>
+    <w:p>
+      <w:pPr>
+        <w:spacing w:before="80" w:after="80"/>
+      </w:pPr>
+      <w:r>
+        <w:t xml:space="preserve"/>
+      </w:r>
+    </w:p>
+    <w:p>
+      <w:pPr>
+        <w:pBdr>
+          <w:bottom w:val="single" w:color="2E75B6" w:sz="6" w:space="3"/>
+        </w:pBdr>
+        <w:spacing w:before="280" w:after="100"/>
+      </w:pPr>
+      <w:r>
+        <w:rPr>
+          <w:rFonts w:ascii="Arial" w:cs="Arial" w:eastAsia="Arial" w:hAnsi="Arial"/>
+          <w:b/>
+          <w:bCs/>
+          <w:color w:val="1E3A5F"/>
+          <w:sz w:val="26"/>
+          <w:szCs w:val="26"/>
+        </w:rPr>
+        <w:t xml:space="preserve">5. Phase 2 — With One More Week</w:t>
+      </w:r>
+    </w:p>
+    <w:p>
+      <w:pPr>
+        <w:spacing w:before="30" w:after="30"/>
+      </w:pPr>
+      <w:r>
+        <w:t xml:space="preserve"/>
       </w:r>
     </w:p>
     <w:p>
@@ -651,16 +914,16 @@
           <w:sz w:val="21"/>
           <w:szCs w:val="21"/>
         </w:rPr>
-        <w:t xml:space="preserve">Customer context via RAG: </w:t>
-      </w:r>
-      <w:r>
-        <w:rPr>
-          <w:rFonts w:ascii="Arial" w:cs="Arial" w:eastAsia="Arial" w:hAnsi="Arial"/>
-          <w:color w:val="222222"/>
-          <w:sz w:val="21"/>
-          <w:szCs w:val="21"/>
-        </w:rPr>
-        <w:t xml:space="preserve">look up the sender's account tier and ticket history before classification. A Platinum customer's bug report should be treated differently from a free-tier inquiry — the routing and priority logic should know that.</w:t>
+        <w:t xml:space="preserve">Live channel integrations: </w:t>
+      </w:r>
+      <w:r>
+        <w:rPr>
+          <w:rFonts w:ascii="Arial" w:cs="Arial" w:eastAsia="Arial" w:hAnsi="Arial"/>
+          <w:color w:val="222222"/>
+          <w:sz w:val="21"/>
+          <w:szCs w:val="21"/>
+        </w:rPr>
+        <w:t xml:space="preserve">connect the FastAPI webhook directly to Gmail (via Gmail API), web form providers, and support portal APIs — replacing send_messages.py with real event sources. The webhook server is already production-ready for this.</w:t>
       </w:r>
     </w:p>
     <w:p>
@@ -681,16 +944,16 @@
           <w:sz w:val="21"/>
           <w:szCs w:val="21"/>
         </w:rPr>
-        <w:t xml:space="preserve">Human feedback loop: </w:t>
-      </w:r>
-      <w:r>
-        <w:rPr>
-          <w:rFonts w:ascii="Arial" w:cs="Arial" w:eastAsia="Arial" w:hAnsi="Arial"/>
-          <w:color w:val="222222"/>
-          <w:sz w:val="21"/>
-          <w:szCs w:val="21"/>
-        </w:rPr>
-        <w:t xml:space="preserve">add a verdict column to the Google Sheet. When agents resolve tickets, they mark whether the classification was correct. Feed verified labels back as few-shot examples into the prompt over time, turning the system into a self-improving classifier.</w:t>
+        <w:t xml:space="preserve">Customer context via RAG: </w:t>
+      </w:r>
+      <w:r>
+        <w:rPr>
+          <w:rFonts w:ascii="Arial" w:cs="Arial" w:eastAsia="Arial" w:hAnsi="Arial"/>
+          <w:color w:val="222222"/>
+          <w:sz w:val="21"/>
+          <w:szCs w:val="21"/>
+        </w:rPr>
+        <w:t xml:space="preserve">look up the sender's account tier and ticket history before classification using any identifier extracted from the message. A Platinum customer's bug report warrants different routing and priority than a free-tier inquiry.</w:t>
       </w:r>
     </w:p>
     <w:p>
@@ -711,16 +974,16 @@
           <w:sz w:val="21"/>
           <w:szCs w:val="21"/>
         </w:rPr>
-        <w:t xml:space="preserve">Escalation notifications: </w:t>
-      </w:r>
-      <w:r>
-        <w:rPr>
-          <w:rFonts w:ascii="Arial" w:cs="Arial" w:eastAsia="Arial" w:hAnsi="Arial"/>
-          <w:color w:val="222222"/>
-          <w:sz w:val="21"/>
-          <w:szCs w:val="21"/>
-        </w:rPr>
-        <w:t xml:space="preserve">push an immediate Slack or email alert to the on-call team when a record is escalated, with the summary and a direct Sheet link. Currently escalated records sit passively waiting to be noticed.</w:t>
+        <w:t xml:space="preserve">Human feedback loop: </w:t>
+      </w:r>
+      <w:r>
+        <w:rPr>
+          <w:rFonts w:ascii="Arial" w:cs="Arial" w:eastAsia="Arial" w:hAnsi="Arial"/>
+          <w:color w:val="222222"/>
+          <w:sz w:val="21"/>
+          <w:szCs w:val="21"/>
+        </w:rPr>
+        <w:t xml:space="preserve">add a verdict column to the Google Sheet. When agents resolve tickets they mark whether the classification was correct. Feed verified labels back as few-shot examples into the prompt over time, creating a self-improving classifier.</w:t>
       </w:r>
     </w:p>
     <w:p>
@@ -741,6 +1004,36 @@
           <w:sz w:val="21"/>
           <w:szCs w:val="21"/>
         </w:rPr>
+        <w:t xml:space="preserve">Escalation notifications: </w:t>
+      </w:r>
+      <w:r>
+        <w:rPr>
+          <w:rFonts w:ascii="Arial" w:cs="Arial" w:eastAsia="Arial" w:hAnsi="Arial"/>
+          <w:color w:val="222222"/>
+          <w:sz w:val="21"/>
+          <w:szCs w:val="21"/>
+        </w:rPr>
+        <w:t xml:space="preserve">push an immediate Slack or email alert to the on-call team when a record is escalated, with the summary and a direct Sheet link. Currently escalated records sit passively — in production the system should reach out proactively.</w:t>
+      </w:r>
+    </w:p>
+    <w:p>
+      <w:pPr>
+        <w:pStyle w:val="ListParagraph"/>
+        <w:numPr>
+          <w:ilvl w:val="0"/>
+          <w:numId w:val="2"/>
+        </w:numPr>
+        <w:spacing w:before="50" w:after="50"/>
+      </w:pPr>
+      <w:r>
+        <w:rPr>
+          <w:rFonts w:ascii="Arial" w:cs="Arial" w:eastAsia="Arial" w:hAnsi="Arial"/>
+          <w:b/>
+          <w:bCs/>
+          <w:color w:val="222222"/>
+          <w:sz w:val="21"/>
+          <w:szCs w:val="21"/>
+        </w:rPr>
         <w:t xml:space="preserve">Metrics dashboard: </w:t>
       </w:r>
       <w:r>
@@ -750,7 +1043,7 @@
           <w:sz w:val="21"/>
           <w:szCs w:val="21"/>
         </w:rPr>
-        <w:t xml:space="preserve">a simple read layer on the output Sheet showing volume by category, average confidence over time, escalation rate, and queue backlog per team — giving managers visibility without touching raw data.</w:t>
+        <w:t xml:space="preserve">a read layer on the output Sheet showing volume by category, average confidence over time, escalation rate, and queue backlog per team — giving managers visibility without touching raw data.</w:t>
       </w:r>
     </w:p>
     <w:p>

</xml_diff>